<commit_message>
Détection langue quand pas de table source
Co-authored-by: Copilot <copilot@github.com>
</commit_message>
<xml_diff>
--- a/renders/DC_BMO_GLOBAL_generated.docx
+++ b/renders/DC_BMO_GLOBAL_generated.docx
@@ -816,40 +816,13 @@
             <w:tcW w:type="dxa" w:w="7937"/>
             <w:vAlign w:val="center"/>
           </w:tcPr>
-          <w:p/>
-        </w:tc>
-      </w:tr>
-      <w:tr>
-        <w:trPr>
-          <w:trHeight w:val="360"/>
-        </w:trPr>
-        <w:tc>
-          <w:tcPr>
-            <w:tcW w:type="dxa" w:w="1701"/>
-            <w:vAlign w:val="center"/>
-          </w:tcPr>
-          <w:p>
-            <w:pPr>
-              <w:pStyle w:val="DCTableYear"/>
-              <w:jc w:val="left"/>
-            </w:pPr>
-            <w:r>
-              <w:t>Langue</w:t>
-            </w:r>
-          </w:p>
-        </w:tc>
-        <w:tc>
-          <w:tcPr>
-            <w:tcW w:type="dxa" w:w="7937"/>
-            <w:vAlign w:val="center"/>
-          </w:tcPr>
           <w:p>
             <w:pPr>
               <w:pStyle w:val="DCTableContent"/>
               <w:jc w:val="left"/>
             </w:pPr>
             <w:r>
-              <w:t>maternelle</w:t>
+              <w:t>Langue maternelle</w:t>
             </w:r>
           </w:p>
         </w:tc>
@@ -881,7 +854,15 @@
             <w:tcW w:type="dxa" w:w="7937"/>
             <w:vAlign w:val="center"/>
           </w:tcPr>
-          <w:p/>
+          <w:p>
+            <w:pPr>
+              <w:pStyle w:val="DCTableContent"/>
+              <w:jc w:val="left"/>
+            </w:pPr>
+            <w:r>
+              <w:t>Courant</w:t>
+            </w:r>
+          </w:p>
         </w:tc>
       </w:tr>
       <w:tr>
@@ -911,111 +892,10 @@
             <w:tcW w:type="dxa" w:w="7937"/>
             <w:vAlign w:val="center"/>
           </w:tcPr>
-          <w:p/>
-        </w:tc>
-      </w:tr>
-    </w:tbl>
-    <w:p>
-      <w:pPr>
-        <w:pStyle w:val="DCNormal"/>
-      </w:pPr>
-    </w:p>
-    <w:tbl>
-      <w:tblPr>
-        <w:tblW w:type="auto" w:w="0"/>
-        <w:tblLayout w:type="fixed"/>
-        <w:tblLook w:firstColumn="1" w:firstRow="1" w:lastColumn="0" w:lastRow="0" w:noHBand="0" w:noVBand="1" w:val="04A0"/>
-      </w:tblPr>
-      <w:tblGrid>
-        <w:gridCol w:w="1363"/>
-        <w:gridCol w:w="9101"/>
-      </w:tblGrid>
-      <w:tr>
-        <w:tc>
-          <w:tcPr>
-            <w:tcW w:type="dxa" w:w="1363"/>
-          </w:tcPr>
-          <w:p>
-            <w:pPr>
-              <w:pStyle w:val="DCTableYear"/>
-            </w:pPr>
-            <w:r>
-              <w:rPr>
-                <w:b/>
-              </w:rPr>
-              <w:t>Français</w:t>
-            </w:r>
-          </w:p>
-        </w:tc>
-        <w:tc>
-          <w:tcPr>
-            <w:tcW w:type="dxa" w:w="9101"/>
-          </w:tcPr>
           <w:p>
             <w:pPr>
               <w:pStyle w:val="DCTableContent"/>
-            </w:pPr>
-            <w:r>
-              <w:t>Langue maternelle</w:t>
-            </w:r>
-          </w:p>
-        </w:tc>
-      </w:tr>
-      <w:tr>
-        <w:tc>
-          <w:tcPr>
-            <w:tcW w:type="dxa" w:w="1363"/>
-          </w:tcPr>
-          <w:p>
-            <w:pPr>
-              <w:pStyle w:val="DCTableYear"/>
-            </w:pPr>
-            <w:r>
-              <w:rPr>
-                <w:b/>
-              </w:rPr>
-              <w:t>Anglais</w:t>
-            </w:r>
-          </w:p>
-        </w:tc>
-        <w:tc>
-          <w:tcPr>
-            <w:tcW w:type="dxa" w:w="9101"/>
-          </w:tcPr>
-          <w:p>
-            <w:pPr>
-              <w:pStyle w:val="DCTableContent"/>
-            </w:pPr>
-            <w:r>
-              <w:t>Courant</w:t>
-            </w:r>
-          </w:p>
-        </w:tc>
-      </w:tr>
-      <w:tr>
-        <w:tc>
-          <w:tcPr>
-            <w:tcW w:type="dxa" w:w="1363"/>
-          </w:tcPr>
-          <w:p>
-            <w:pPr>
-              <w:pStyle w:val="DCTableYear"/>
-            </w:pPr>
-            <w:r>
-              <w:rPr>
-                <w:b/>
-              </w:rPr>
-              <w:t>Japonais</w:t>
-            </w:r>
-          </w:p>
-        </w:tc>
-        <w:tc>
-          <w:tcPr>
-            <w:tcW w:type="dxa" w:w="9101"/>
-          </w:tcPr>
-          <w:p>
-            <w:pPr>
-              <w:pStyle w:val="DCTableContent"/>
+              <w:jc w:val="left"/>
             </w:pPr>
             <w:r>
               <w:t>Bon niveau</w:t>

</xml_diff>